<commit_message>
Update customer churn Word report
</commit_message>
<xml_diff>
--- a/Customer Churn Project Report.docx
+++ b/Customer Churn Project Report.docx
@@ -14,13 +14,7 @@
     </w:p>
     <w:p>
       <w:r>
-        <w:t xml:space="preserve">This project </w:t>
-      </w:r>
-      <w:r>
-        <w:t>analyses</w:t>
-      </w:r>
-      <w:r>
-        <w:t xml:space="preserve"> customer churn, predicts customers who may leave, segments customers by risk and revenue, and provides safe retention recommendations.</w:t>
+        <w:t>This project analyses customer churn, predicts customers who may leave, segments customers by risk and revenue, and provides safe retention recommendations.</w:t>
       </w:r>
     </w:p>
     <w:p/>
@@ -37,13 +31,8 @@
           <w:numId w:val="2"/>
         </w:numPr>
       </w:pPr>
-      <w:proofErr w:type="spellStart"/>
-      <w:r>
-        <w:t>TotalCharges</w:t>
-      </w:r>
-      <w:proofErr w:type="spellEnd"/>
-      <w:r>
-        <w:t xml:space="preserve"> contained spaces and was initially read as text.</w:t>
+      <w:r>
+        <w:t>TotalCharges contained spaces and was initially read as text.</w:t>
       </w:r>
     </w:p>
     <w:p>
@@ -67,15 +56,7 @@
         </w:numPr>
       </w:pPr>
       <w:r>
-        <w:t xml:space="preserve">Missing </w:t>
-      </w:r>
-      <w:proofErr w:type="spellStart"/>
-      <w:r>
-        <w:t>TotalCharges</w:t>
-      </w:r>
-      <w:proofErr w:type="spellEnd"/>
-      <w:r>
-        <w:t xml:space="preserve"> values were filled with 0 because those customers had zero tenure.</w:t>
+        <w:t>Missing TotalCharges values were filled with 0 because those customers had zero tenure.</w:t>
       </w:r>
     </w:p>
     <w:p>
@@ -122,13 +103,8 @@
           <w:numId w:val="2"/>
         </w:numPr>
       </w:pPr>
-      <w:proofErr w:type="spellStart"/>
-      <w:r>
-        <w:t>customerID</w:t>
-      </w:r>
-      <w:proofErr w:type="spellEnd"/>
-      <w:r>
-        <w:t xml:space="preserve"> was removed because it is only an identifier.</w:t>
+      <w:r>
+        <w:t>customerID was removed because it is only an identifier.</w:t>
       </w:r>
     </w:p>
     <w:p>
@@ -630,15 +606,7 @@
     </w:p>
     <w:p>
       <w:r>
-        <w:t xml:space="preserve">The recommended actions are </w:t>
-      </w:r>
-      <w:proofErr w:type="spellStart"/>
-      <w:r>
-        <w:t>onboarding</w:t>
-      </w:r>
-      <w:proofErr w:type="spellEnd"/>
-      <w:r>
-        <w:t xml:space="preserve"> support, service issue resolution, and carefully approved retention offers.</w:t>
+        <w:t>The recommended actions are onboarding support, service issue resolution, and carefully approved retention offers.</w:t>
       </w:r>
     </w:p>
     <w:p>
@@ -684,10 +652,10 @@
             <v:path o:extrusionok="f" gradientshapeok="t" o:connecttype="rect"/>
             <o:lock v:ext="edit" aspectratio="t"/>
           </v:shapetype>
-          <v:shape id="_x0000_i1117" type="#_x0000_t75" style="width:150.6pt;height:57pt" o:ole="">
+          <v:shape id="_x0000_i1031" type="#_x0000_t75" style="width:150.6pt;height:57pt" o:ole="">
             <v:imagedata r:id="rId5" o:title=""/>
           </v:shape>
-          <w:control r:id="rId6" w:name="DefaultOcxName" w:shapeid="_x0000_i1117"/>
+          <w:control r:id="rId6" w:name="DefaultOcxName" w:shapeid="_x0000_i1031"/>
         </w:object>
       </w:r>
     </w:p>
@@ -700,10 +668,10 @@
       </w:r>
       <w:r>
         <w:object w:dxaOrig="225" w:dyaOrig="225">
-          <v:shape id="_x0000_i1123" type="#_x0000_t75" style="width:150.6pt;height:57pt" o:ole="">
+          <v:shape id="_x0000_i1034" type="#_x0000_t75" style="width:150.6pt;height:57pt" o:ole="">
             <v:imagedata r:id="rId7" o:title=""/>
           </v:shape>
-          <w:control r:id="rId8" w:name="DefaultOcxName1" w:shapeid="_x0000_i1123"/>
+          <w:control r:id="rId8" w:name="DefaultOcxName1" w:shapeid="_x0000_i1034"/>
         </w:object>
       </w:r>
     </w:p>
@@ -823,11 +791,9 @@
       <w:pPr>
         <w:jc w:val="both"/>
       </w:pPr>
-      <w:proofErr w:type="spellStart"/>
       <w:r>
         <w:t>SeniorCitizen</w:t>
       </w:r>
-      <w:proofErr w:type="spellEnd"/>
     </w:p>
     <w:p>
       <w:pPr>
@@ -1055,10 +1021,23 @@
       <w:pPr>
         <w:jc w:val="both"/>
       </w:pPr>
+    </w:p>
+    <w:p/>
+    <w:p>
+      <w:pPr>
+        <w:pStyle w:val="Heading1"/>
+      </w:pPr>
+      <w:r>
+        <w:t>7. LLM Prompt Data Filtering</w:t>
+      </w:r>
+    </w:p>
+    <w:p>
+      <w:r>
+        <w:t>Even if the churn model used demographic fields during training, passing the full customer row to the LLM could cause the generated explanation to mention or rely on gender, senior-citizen status, family status, or partner status. That could lead to discriminatory offers, inconsistent treatment, privacy concerns, and compliance problems. In this project, the LLM context is restricted to the retrieved clause, the churn risk score, tenure, and approved non-demographic top features such as TotalCharges and MonthlyCharges. The fields gender, SeniorCitizen, Partner, and Dependents are excluded before the prompt is built, and the code checks that no prohibited fields are present. Clause 4 is also included as a mandatory non-discrimination rule.</w:t>
+      </w:r>
       <w:bookmarkStart w:id="0" w:name="_GoBack"/>
       <w:bookmarkEnd w:id="0"/>
     </w:p>
-    <w:p/>
     <w:sectPr>
       <w:pgSz w:w="11906" w:h="16838"/>
       <w:pgMar w:top="1440" w:right="1440" w:bottom="1440" w:left="1440" w:header="708" w:footer="708" w:gutter="0"/>
@@ -2773,6 +2752,27 @@
     <w:name w:val="Normal"/>
     <w:qFormat/>
   </w:style>
+  <w:style w:type="paragraph" w:styleId="Heading1">
+    <w:name w:val="heading 1"/>
+    <w:basedOn w:val="Normal"/>
+    <w:next w:val="Normal"/>
+    <w:link w:val="Heading1Char"/>
+    <w:uiPriority w:val="9"/>
+    <w:qFormat/>
+    <w:rsid w:val="00214501"/>
+    <w:pPr>
+      <w:keepNext/>
+      <w:keepLines/>
+      <w:spacing w:before="240" w:after="0"/>
+      <w:outlineLvl w:val="0"/>
+    </w:pPr>
+    <w:rPr>
+      <w:rFonts w:asciiTheme="majorHAnsi" w:eastAsiaTheme="majorEastAsia" w:hAnsiTheme="majorHAnsi" w:cstheme="majorBidi"/>
+      <w:color w:val="2E74B5" w:themeColor="accent1" w:themeShade="BF"/>
+      <w:sz w:val="32"/>
+      <w:szCs w:val="32"/>
+    </w:rPr>
+  </w:style>
   <w:style w:type="paragraph" w:styleId="Heading2">
     <w:name w:val="heading 2"/>
     <w:basedOn w:val="Normal"/>
@@ -2796,6 +2796,7 @@
   <w:style w:type="character" w:default="1" w:styleId="DefaultParagraphFont">
     <w:name w:val="Default Paragraph Font"/>
     <w:uiPriority w:val="1"/>
+    <w:semiHidden/>
     <w:unhideWhenUsed/>
   </w:style>
   <w:style w:type="table" w:default="1" w:styleId="TableNormal">
@@ -2865,6 +2866,19 @@
     <w:name w:val="mtk1"/>
     <w:basedOn w:val="DefaultParagraphFont"/>
     <w:rsid w:val="007E1ABD"/>
+  </w:style>
+  <w:style w:type="character" w:customStyle="1" w:styleId="Heading1Char">
+    <w:name w:val="Heading 1 Char"/>
+    <w:basedOn w:val="DefaultParagraphFont"/>
+    <w:link w:val="Heading1"/>
+    <w:uiPriority w:val="9"/>
+    <w:rsid w:val="00214501"/>
+    <w:rPr>
+      <w:rFonts w:asciiTheme="majorHAnsi" w:eastAsiaTheme="majorEastAsia" w:hAnsiTheme="majorHAnsi" w:cstheme="majorBidi"/>
+      <w:color w:val="2E74B5" w:themeColor="accent1" w:themeShade="BF"/>
+      <w:sz w:val="32"/>
+      <w:szCs w:val="32"/>
+    </w:rPr>
   </w:style>
 </w:styles>
 </file>

</xml_diff>